<commit_message>
code thành .apk nhưng lỗi
</commit_message>
<xml_diff>
--- a/docs/PRD_VinhKhanhTour.docx
+++ b/docs/PRD_VinhKhanhTour.docx
@@ -2257,7 +2257,27 @@
           <w:i/>
           <w:color w:val="595959"/>
         </w:rPr>
-        <w:t xml:space="preserve">Hình 0 – Use case tổng </w:t>
+        <w:t xml:space="preserve">Hình 0 – Use case </w:t>
+      </w:r>
+      <w:proofErr w:type="spellStart"/>
+      <w:r>
+        <w:rPr>
+          <w:rFonts w:ascii="Times New Roman" w:eastAsia="Times New Roman" w:hAnsi="Times New Roman" w:cs="Times New Roman"/>
+          <w:b/>
+          <w:i/>
+          <w:color w:val="595959"/>
+        </w:rPr>
+        <w:t>tổng</w:t>
+      </w:r>
+      <w:proofErr w:type="spellEnd"/>
+      <w:r>
+        <w:rPr>
+          <w:rFonts w:ascii="Times New Roman" w:eastAsia="Times New Roman" w:hAnsi="Times New Roman" w:cs="Times New Roman"/>
+          <w:b/>
+          <w:i/>
+          <w:color w:val="595959"/>
+        </w:rPr>
+        <w:t xml:space="preserve"> </w:t>
       </w:r>
       <w:proofErr w:type="spellStart"/>
       <w:r>
@@ -2594,9 +2614,9 @@
         </w:rPr>
         <w:lastRenderedPageBreak/>
         <w:drawing>
-          <wp:inline distT="0" distB="0" distL="0" distR="0" wp14:anchorId="2FF32F23" wp14:editId="1F642530">
-            <wp:extent cx="3960000" cy="3649770"/>
-            <wp:effectExtent l="0" t="0" r="0" b="0"/>
+          <wp:inline distT="0" distB="0" distL="0" distR="0" wp14:anchorId="2FF32F23" wp14:editId="68A27DAF">
+            <wp:extent cx="6192507" cy="5707380"/>
+            <wp:effectExtent l="0" t="0" r="0" b="7620"/>
             <wp:docPr id="3" name="Picture 3"/>
             <wp:cNvGraphicFramePr>
               <a:graphicFrameLocks xmlns:a="http://schemas.openxmlformats.org/drawingml/2006/main" noChangeAspect="1"/>
@@ -2617,7 +2637,7 @@
                   <pic:spPr>
                     <a:xfrm>
                       <a:off x="0" y="0"/>
-                      <a:ext cx="3960000" cy="3649770"/>
+                      <a:ext cx="6217224" cy="5730161"/>
                     </a:xfrm>
                     <a:prstGeom prst="rect">
                       <a:avLst/>
@@ -2678,7 +2698,23 @@
           <w:rFonts w:ascii="Times New Roman" w:eastAsia="Times New Roman" w:hAnsi="Times New Roman" w:cs="Times New Roman"/>
           <w:i/>
         </w:rPr>
-        <w:t>Điều kiện lọc: TrangThai = true AND (NgayHetHanDuyTri IS NULL OR NgayHetHanDuyTri &gt; now())</w:t>
+        <w:t xml:space="preserve">Điều kiện lọc: TrangThai = true AND (NgayHetHanDuyTri IS NULL OR NgayHetHanDuyTri &gt; </w:t>
+      </w:r>
+      <w:proofErr w:type="gramStart"/>
+      <w:r>
+        <w:rPr>
+          <w:rFonts w:ascii="Times New Roman" w:eastAsia="Times New Roman" w:hAnsi="Times New Roman" w:cs="Times New Roman"/>
+          <w:i/>
+        </w:rPr>
+        <w:t>now(</w:t>
+      </w:r>
+      <w:proofErr w:type="gramEnd"/>
+      <w:r>
+        <w:rPr>
+          <w:rFonts w:ascii="Times New Roman" w:eastAsia="Times New Roman" w:hAnsi="Times New Roman" w:cs="Times New Roman"/>
+          <w:i/>
+        </w:rPr>
+        <w:t>))</w:t>
       </w:r>
     </w:p>
     <w:p>
@@ -2951,7 +2987,23 @@
           <w:rFonts w:ascii="Times New Roman" w:eastAsia="Times New Roman" w:hAnsi="Times New Roman" w:cs="Times New Roman"/>
           <w:sz w:val="24"/>
         </w:rPr>
-        <w:t>Gọi SpeakPoiAsync() → GET /api/thuyet-minh/{poiId}?lang={ngonNgu}</w:t>
+        <w:t xml:space="preserve">Gọi </w:t>
+      </w:r>
+      <w:proofErr w:type="gramStart"/>
+      <w:r>
+        <w:rPr>
+          <w:rFonts w:ascii="Times New Roman" w:eastAsia="Times New Roman" w:hAnsi="Times New Roman" w:cs="Times New Roman"/>
+          <w:sz w:val="24"/>
+        </w:rPr>
+        <w:t>SpeakPoiAsync(</w:t>
+      </w:r>
+      <w:proofErr w:type="gramEnd"/>
+      <w:r>
+        <w:rPr>
+          <w:rFonts w:ascii="Times New Roman" w:eastAsia="Times New Roman" w:hAnsi="Times New Roman" w:cs="Times New Roman"/>
+          <w:sz w:val="24"/>
+        </w:rPr>
+        <w:t>) → GET /api/thuyet-minh/{poiId}?lang={ngonNgu}</w:t>
       </w:r>
     </w:p>
     <w:p>
@@ -3890,7 +3942,39 @@
           <w:rFonts w:ascii="Times New Roman" w:eastAsia="Times New Roman" w:hAnsi="Times New Roman" w:cs="Times New Roman"/>
           <w:sz w:val="24"/>
         </w:rPr>
-        <w:t>Trạng thái từng thiết bị: GetStatusText() / GetSubscriptionText()</w:t>
+        <w:t xml:space="preserve">Trạng thái từng thiết bị: </w:t>
+      </w:r>
+      <w:proofErr w:type="gramStart"/>
+      <w:r>
+        <w:rPr>
+          <w:rFonts w:ascii="Times New Roman" w:eastAsia="Times New Roman" w:hAnsi="Times New Roman" w:cs="Times New Roman"/>
+          <w:sz w:val="24"/>
+        </w:rPr>
+        <w:t>GetStatusText(</w:t>
+      </w:r>
+      <w:proofErr w:type="gramEnd"/>
+      <w:r>
+        <w:rPr>
+          <w:rFonts w:ascii="Times New Roman" w:eastAsia="Times New Roman" w:hAnsi="Times New Roman" w:cs="Times New Roman"/>
+          <w:sz w:val="24"/>
+        </w:rPr>
+        <w:t xml:space="preserve">) / </w:t>
+      </w:r>
+      <w:proofErr w:type="gramStart"/>
+      <w:r>
+        <w:rPr>
+          <w:rFonts w:ascii="Times New Roman" w:eastAsia="Times New Roman" w:hAnsi="Times New Roman" w:cs="Times New Roman"/>
+          <w:sz w:val="24"/>
+        </w:rPr>
+        <w:t>GetSubscriptionText(</w:t>
+      </w:r>
+      <w:proofErr w:type="gramEnd"/>
+      <w:r>
+        <w:rPr>
+          <w:rFonts w:ascii="Times New Roman" w:eastAsia="Times New Roman" w:hAnsi="Times New Roman" w:cs="Times New Roman"/>
+          <w:sz w:val="24"/>
+        </w:rPr>
+        <w:t>)</w:t>
       </w:r>
     </w:p>
     <w:p>
@@ -4254,7 +4338,21 @@
               <w:rPr>
                 <w:rFonts w:ascii="Times New Roman" w:eastAsia="Times New Roman" w:hAnsi="Times New Roman" w:cs="Times New Roman"/>
               </w:rPr>
-              <w:t>/Poi/Edit/{id}</w:t>
+              <w:t>/Poi/</w:t>
+            </w:r>
+            <w:proofErr w:type="gramStart"/>
+            <w:r>
+              <w:rPr>
+                <w:rFonts w:ascii="Times New Roman" w:eastAsia="Times New Roman" w:hAnsi="Times New Roman" w:cs="Times New Roman"/>
+              </w:rPr>
+              <w:t>Edit</w:t>
+            </w:r>
+            <w:proofErr w:type="gramEnd"/>
+            <w:r>
+              <w:rPr>
+                <w:rFonts w:ascii="Times New Roman" w:eastAsia="Times New Roman" w:hAnsi="Times New Roman" w:cs="Times New Roman"/>
+              </w:rPr>
+              <w:t>/{id}</w:t>
             </w:r>
           </w:p>
         </w:tc>
@@ -4304,7 +4402,21 @@
               <w:rPr>
                 <w:rFonts w:ascii="Times New Roman" w:eastAsia="Times New Roman" w:hAnsi="Times New Roman" w:cs="Times New Roman"/>
               </w:rPr>
-              <w:t>/ThuyetMinh/Edit/{id}</w:t>
+              <w:t>/ThuyetMinh/</w:t>
+            </w:r>
+            <w:proofErr w:type="gramStart"/>
+            <w:r>
+              <w:rPr>
+                <w:rFonts w:ascii="Times New Roman" w:eastAsia="Times New Roman" w:hAnsi="Times New Roman" w:cs="Times New Roman"/>
+              </w:rPr>
+              <w:t>Edit/{</w:t>
+            </w:r>
+            <w:proofErr w:type="gramEnd"/>
+            <w:r>
+              <w:rPr>
+                <w:rFonts w:ascii="Times New Roman" w:eastAsia="Times New Roman" w:hAnsi="Times New Roman" w:cs="Times New Roman"/>
+              </w:rPr>
+              <w:t>id}</w:t>
             </w:r>
           </w:p>
         </w:tc>
@@ -4390,7 +4502,25 @@
           <w:i/>
           <w:sz w:val="24"/>
         </w:rPr>
-        <w:t>Upload ảnh: POST /api/upload — tối đa 5MB, định dạng: .jpg, .jpeg, .png, .webp, .gif</w:t>
+        <w:t>Upload ảnh: POST /api/upload — tối đa 5MB, định dạng: .jpg, .jpeg, .png</w:t>
+      </w:r>
+      <w:proofErr w:type="gramStart"/>
+      <w:r>
+        <w:rPr>
+          <w:rFonts w:ascii="Times New Roman" w:eastAsia="Times New Roman" w:hAnsi="Times New Roman" w:cs="Times New Roman"/>
+          <w:i/>
+          <w:sz w:val="24"/>
+        </w:rPr>
+        <w:t>, .webp</w:t>
+      </w:r>
+      <w:proofErr w:type="gramEnd"/>
+      <w:r>
+        <w:rPr>
+          <w:rFonts w:ascii="Times New Roman" w:eastAsia="Times New Roman" w:hAnsi="Times New Roman" w:cs="Times New Roman"/>
+          <w:i/>
+          <w:sz w:val="24"/>
+        </w:rPr>
+        <w:t>, .gif</w:t>
       </w:r>
     </w:p>
     <w:p>
@@ -4770,7 +4900,55 @@
           <w:rFonts w:ascii="Times New Roman" w:eastAsia="Times New Roman" w:hAnsi="Times New Roman" w:cs="Times New Roman"/>
           <w:sz w:val="24"/>
         </w:rPr>
-        <w:t>_db.POIs.Include(MonAns).OrderBy(MucUuTien).ToListAsync()</w:t>
+        <w:t>_</w:t>
+      </w:r>
+      <w:proofErr w:type="gramStart"/>
+      <w:r>
+        <w:rPr>
+          <w:rFonts w:ascii="Times New Roman" w:eastAsia="Times New Roman" w:hAnsi="Times New Roman" w:cs="Times New Roman"/>
+          <w:sz w:val="24"/>
+        </w:rPr>
+        <w:t>db.POIs.Include</w:t>
+      </w:r>
+      <w:proofErr w:type="gramEnd"/>
+      <w:r>
+        <w:rPr>
+          <w:rFonts w:ascii="Times New Roman" w:eastAsia="Times New Roman" w:hAnsi="Times New Roman" w:cs="Times New Roman"/>
+          <w:sz w:val="24"/>
+        </w:rPr>
+        <w:t>(MonAns</w:t>
+      </w:r>
+      <w:proofErr w:type="gramStart"/>
+      <w:r>
+        <w:rPr>
+          <w:rFonts w:ascii="Times New Roman" w:eastAsia="Times New Roman" w:hAnsi="Times New Roman" w:cs="Times New Roman"/>
+          <w:sz w:val="24"/>
+        </w:rPr>
+        <w:t>).OrderBy</w:t>
+      </w:r>
+      <w:proofErr w:type="gramEnd"/>
+      <w:r>
+        <w:rPr>
+          <w:rFonts w:ascii="Times New Roman" w:eastAsia="Times New Roman" w:hAnsi="Times New Roman" w:cs="Times New Roman"/>
+          <w:sz w:val="24"/>
+        </w:rPr>
+        <w:t>(MucUuTien</w:t>
+      </w:r>
+      <w:proofErr w:type="gramStart"/>
+      <w:r>
+        <w:rPr>
+          <w:rFonts w:ascii="Times New Roman" w:eastAsia="Times New Roman" w:hAnsi="Times New Roman" w:cs="Times New Roman"/>
+          <w:sz w:val="24"/>
+        </w:rPr>
+        <w:t>).ToListAsync</w:t>
+      </w:r>
+      <w:proofErr w:type="gramEnd"/>
+      <w:r>
+        <w:rPr>
+          <w:rFonts w:ascii="Times New Roman" w:eastAsia="Times New Roman" w:hAnsi="Times New Roman" w:cs="Times New Roman"/>
+          <w:sz w:val="24"/>
+        </w:rPr>
+        <w:t>()</w:t>
       </w:r>
     </w:p>
     <w:p>
@@ -5624,7 +5802,35 @@
               <w:rPr>
                 <w:rFonts w:ascii="Times New Roman" w:eastAsia="Times New Roman" w:hAnsi="Times New Roman" w:cs="Times New Roman"/>
               </w:rPr>
-              <w:t>/api/poi/{id}</w:t>
+              <w:t>/</w:t>
+            </w:r>
+            <w:proofErr w:type="gramStart"/>
+            <w:r>
+              <w:rPr>
+                <w:rFonts w:ascii="Times New Roman" w:eastAsia="Times New Roman" w:hAnsi="Times New Roman" w:cs="Times New Roman"/>
+              </w:rPr>
+              <w:t>api</w:t>
+            </w:r>
+            <w:proofErr w:type="gramEnd"/>
+            <w:r>
+              <w:rPr>
+                <w:rFonts w:ascii="Times New Roman" w:eastAsia="Times New Roman" w:hAnsi="Times New Roman" w:cs="Times New Roman"/>
+              </w:rPr>
+              <w:t>/</w:t>
+            </w:r>
+            <w:proofErr w:type="gramStart"/>
+            <w:r>
+              <w:rPr>
+                <w:rFonts w:ascii="Times New Roman" w:eastAsia="Times New Roman" w:hAnsi="Times New Roman" w:cs="Times New Roman"/>
+              </w:rPr>
+              <w:t>poi/{</w:t>
+            </w:r>
+            <w:proofErr w:type="gramEnd"/>
+            <w:r>
+              <w:rPr>
+                <w:rFonts w:ascii="Times New Roman" w:eastAsia="Times New Roman" w:hAnsi="Times New Roman" w:cs="Times New Roman"/>
+              </w:rPr>
+              <w:t>id}</w:t>
             </w:r>
           </w:p>
         </w:tc>
@@ -5819,7 +6025,21 @@
               <w:rPr>
                 <w:rFonts w:ascii="Times New Roman" w:eastAsia="Times New Roman" w:hAnsi="Times New Roman" w:cs="Times New Roman"/>
               </w:rPr>
-              <w:t>/api/subscription/status/{maThietBi}</w:t>
+              <w:t>/api/subscription/</w:t>
+            </w:r>
+            <w:proofErr w:type="gramStart"/>
+            <w:r>
+              <w:rPr>
+                <w:rFonts w:ascii="Times New Roman" w:eastAsia="Times New Roman" w:hAnsi="Times New Roman" w:cs="Times New Roman"/>
+              </w:rPr>
+              <w:t>status/{</w:t>
+            </w:r>
+            <w:proofErr w:type="gramEnd"/>
+            <w:r>
+              <w:rPr>
+                <w:rFonts w:ascii="Times New Roman" w:eastAsia="Times New Roman" w:hAnsi="Times New Roman" w:cs="Times New Roman"/>
+              </w:rPr>
+              <w:t>maThietBi}</w:t>
             </w:r>
           </w:p>
         </w:tc>
@@ -5969,7 +6189,21 @@
               <w:rPr>
                 <w:rFonts w:ascii="Times New Roman" w:eastAsia="Times New Roman" w:hAnsi="Times New Roman" w:cs="Times New Roman"/>
               </w:rPr>
-              <w:t>/api/subscription/request/{id}</w:t>
+              <w:t>/api/subscription/</w:t>
+            </w:r>
+            <w:proofErr w:type="gramStart"/>
+            <w:r>
+              <w:rPr>
+                <w:rFonts w:ascii="Times New Roman" w:eastAsia="Times New Roman" w:hAnsi="Times New Roman" w:cs="Times New Roman"/>
+              </w:rPr>
+              <w:t>request/{</w:t>
+            </w:r>
+            <w:proofErr w:type="gramEnd"/>
+            <w:r>
+              <w:rPr>
+                <w:rFonts w:ascii="Times New Roman" w:eastAsia="Times New Roman" w:hAnsi="Times New Roman" w:cs="Times New Roman"/>
+              </w:rPr>
+              <w:t>id}</w:t>
             </w:r>
           </w:p>
         </w:tc>
@@ -6019,7 +6253,21 @@
               <w:rPr>
                 <w:rFonts w:ascii="Times New Roman" w:eastAsia="Times New Roman" w:hAnsi="Times New Roman" w:cs="Times New Roman"/>
               </w:rPr>
-              <w:t>/api/subscription/approve/{id}</w:t>
+              <w:t>/api/subscription/</w:t>
+            </w:r>
+            <w:proofErr w:type="gramStart"/>
+            <w:r>
+              <w:rPr>
+                <w:rFonts w:ascii="Times New Roman" w:eastAsia="Times New Roman" w:hAnsi="Times New Roman" w:cs="Times New Roman"/>
+              </w:rPr>
+              <w:t>approve/{</w:t>
+            </w:r>
+            <w:proofErr w:type="gramEnd"/>
+            <w:r>
+              <w:rPr>
+                <w:rFonts w:ascii="Times New Roman" w:eastAsia="Times New Roman" w:hAnsi="Times New Roman" w:cs="Times New Roman"/>
+              </w:rPr>
+              <w:t>id}</w:t>
             </w:r>
           </w:p>
         </w:tc>
@@ -6069,7 +6317,21 @@
               <w:rPr>
                 <w:rFonts w:ascii="Times New Roman" w:eastAsia="Times New Roman" w:hAnsi="Times New Roman" w:cs="Times New Roman"/>
               </w:rPr>
-              <w:t>/api/subscription/reject/{id}</w:t>
+              <w:t>/api/subscription/</w:t>
+            </w:r>
+            <w:proofErr w:type="gramStart"/>
+            <w:r>
+              <w:rPr>
+                <w:rFonts w:ascii="Times New Roman" w:eastAsia="Times New Roman" w:hAnsi="Times New Roman" w:cs="Times New Roman"/>
+              </w:rPr>
+              <w:t>reject/{</w:t>
+            </w:r>
+            <w:proofErr w:type="gramEnd"/>
+            <w:r>
+              <w:rPr>
+                <w:rFonts w:ascii="Times New Roman" w:eastAsia="Times New Roman" w:hAnsi="Times New Roman" w:cs="Times New Roman"/>
+              </w:rPr>
+              <w:t>id}</w:t>
             </w:r>
           </w:p>
         </w:tc>
@@ -6514,7 +6776,21 @@
               <w:rPr>
                 <w:rFonts w:ascii="Times New Roman" w:eastAsia="Times New Roman" w:hAnsi="Times New Roman" w:cs="Times New Roman"/>
               </w:rPr>
-              <w:t>/api/heartbeat/history/{deviceShort}</w:t>
+              <w:t>/api/heartbeat/</w:t>
+            </w:r>
+            <w:proofErr w:type="gramStart"/>
+            <w:r>
+              <w:rPr>
+                <w:rFonts w:ascii="Times New Roman" w:eastAsia="Times New Roman" w:hAnsi="Times New Roman" w:cs="Times New Roman"/>
+              </w:rPr>
+              <w:t>history/{</w:t>
+            </w:r>
+            <w:proofErr w:type="gramEnd"/>
+            <w:r>
+              <w:rPr>
+                <w:rFonts w:ascii="Times New Roman" w:eastAsia="Times New Roman" w:hAnsi="Times New Roman" w:cs="Times New Roman"/>
+              </w:rPr>
+              <w:t>deviceShort}</w:t>
             </w:r>
           </w:p>
         </w:tc>
@@ -6659,7 +6935,21 @@
               <w:rPr>
                 <w:rFonts w:ascii="Times New Roman" w:eastAsia="Times New Roman" w:hAnsi="Times New Roman" w:cs="Times New Roman"/>
               </w:rPr>
-              <w:t>/api/payment/status/{poiId}</w:t>
+              <w:t>/api/payment/</w:t>
+            </w:r>
+            <w:proofErr w:type="gramStart"/>
+            <w:r>
+              <w:rPr>
+                <w:rFonts w:ascii="Times New Roman" w:eastAsia="Times New Roman" w:hAnsi="Times New Roman" w:cs="Times New Roman"/>
+              </w:rPr>
+              <w:t>status/{</w:t>
+            </w:r>
+            <w:proofErr w:type="gramEnd"/>
+            <w:r>
+              <w:rPr>
+                <w:rFonts w:ascii="Times New Roman" w:eastAsia="Times New Roman" w:hAnsi="Times New Roman" w:cs="Times New Roman"/>
+              </w:rPr>
+              <w:t>poiId}</w:t>
             </w:r>
           </w:p>
         </w:tc>
@@ -6709,7 +6999,21 @@
               <w:rPr>
                 <w:rFonts w:ascii="Times New Roman" w:eastAsia="Times New Roman" w:hAnsi="Times New Roman" w:cs="Times New Roman"/>
               </w:rPr>
-              <w:t>/api/payment/history/{poiId}</w:t>
+              <w:t>/api/payment/</w:t>
+            </w:r>
+            <w:proofErr w:type="gramStart"/>
+            <w:r>
+              <w:rPr>
+                <w:rFonts w:ascii="Times New Roman" w:eastAsia="Times New Roman" w:hAnsi="Times New Roman" w:cs="Times New Roman"/>
+              </w:rPr>
+              <w:t>history/{</w:t>
+            </w:r>
+            <w:proofErr w:type="gramEnd"/>
+            <w:r>
+              <w:rPr>
+                <w:rFonts w:ascii="Times New Roman" w:eastAsia="Times New Roman" w:hAnsi="Times New Roman" w:cs="Times New Roman"/>
+              </w:rPr>
+              <w:t>poiId}</w:t>
             </w:r>
           </w:p>
         </w:tc>
@@ -6809,7 +7113,21 @@
               <w:rPr>
                 <w:rFonts w:ascii="Times New Roman" w:eastAsia="Times New Roman" w:hAnsi="Times New Roman" w:cs="Times New Roman"/>
               </w:rPr>
-              <w:t>/api/payment/convert/{poiId}</w:t>
+              <w:t>/api/payment/</w:t>
+            </w:r>
+            <w:proofErr w:type="gramStart"/>
+            <w:r>
+              <w:rPr>
+                <w:rFonts w:ascii="Times New Roman" w:eastAsia="Times New Roman" w:hAnsi="Times New Roman" w:cs="Times New Roman"/>
+              </w:rPr>
+              <w:t>convert/{</w:t>
+            </w:r>
+            <w:proofErr w:type="gramEnd"/>
+            <w:r>
+              <w:rPr>
+                <w:rFonts w:ascii="Times New Roman" w:eastAsia="Times New Roman" w:hAnsi="Times New Roman" w:cs="Times New Roman"/>
+              </w:rPr>
+              <w:t>poiId}</w:t>
             </w:r>
           </w:p>
         </w:tc>
@@ -7004,7 +7322,21 @@
               <w:rPr>
                 <w:rFonts w:ascii="Times New Roman" w:eastAsia="Times New Roman" w:hAnsi="Times New Roman" w:cs="Times New Roman"/>
               </w:rPr>
-              <w:t>/api/thuyet-minh/{poiId}?lang=vi</w:t>
+              <w:t>/api/thuyet-</w:t>
+            </w:r>
+            <w:proofErr w:type="gramStart"/>
+            <w:r>
+              <w:rPr>
+                <w:rFonts w:ascii="Times New Roman" w:eastAsia="Times New Roman" w:hAnsi="Times New Roman" w:cs="Times New Roman"/>
+              </w:rPr>
+              <w:t>minh/{poiId}?</w:t>
+            </w:r>
+            <w:proofErr w:type="gramEnd"/>
+            <w:r>
+              <w:rPr>
+                <w:rFonts w:ascii="Times New Roman" w:eastAsia="Times New Roman" w:hAnsi="Times New Roman" w:cs="Times New Roman"/>
+              </w:rPr>
+              <w:t>lang=vi</w:t>
             </w:r>
           </w:p>
         </w:tc>

</xml_diff>